<commit_message>
Instagram guide: record completed Meta app setup and launch-day steps
Co-Authored-By: Claude Opus 5.5 <noreply@anthropic.com>
Claude-Session: https://claude.ai/code/session_01AQvRoJbu3autEaEnC9DQeD
</commit_message>
<xml_diff>
--- a/docs/Guia_Instagram.docx
+++ b/docs/Guia_Instagram.docx
@@ -218,6 +218,110 @@
       </w:pPr>
       <w:r>
         <w:t>https://dev.to/peter11241342/instagram-dm-automation-with-webhooks-a-developers-setup-guide-2026-4emd (tercero)</w:t>
+      </w:r>
+    </w:p>
+    <w:p>
+      <w:pPr>
+        <w:pStyle w:val="Heading2"/>
+      </w:pPr>
+      <w:r>
+        <w:t>Estado al 26-10-2026 (Parte 1 completada)</w:t>
+      </w:r>
+    </w:p>
+    <w:p>
+      <w:pPr>
+        <w:pStyle w:val="ListBullet"/>
+      </w:pPr>
+      <w:r>
+        <w:t>@cestoriashop: cuenta profesional, pública y con «Permitir el acceso a los mensajes» activado.</w:t>
+      </w:r>
+    </w:p>
+    <w:p>
+      <w:pPr>
+        <w:pStyle w:val="ListBullet"/>
+      </w:pPr>
+      <w:r>
+        <w:t>App de Meta «Cestoria Respuestas» (ID 1730527034678364) creada en el portfolio Cestoria, caso de uso «Administrar mensajes y contenido en Instagram».</w:t>
+      </w:r>
+    </w:p>
+    <w:p>
+      <w:pPr>
+        <w:pStyle w:val="ListBullet"/>
+      </w:pPr>
+      <w:r>
+        <w:t>Permisos añadidos: instagram_business_basic, instagram_business_manage_comments, instagram_business_manage_messages.</w:t>
+      </w:r>
+    </w:p>
+    <w:p>
+      <w:pPr>
+        <w:pStyle w:val="ListBullet"/>
+      </w:pPr>
+      <w:r>
+        <w:t>@cestoriashop agregada como Evaluador de Instagram y como cuenta de la API (ID 17841424417134943). Token aún sin generar (se genera el día de la publicación).</w:t>
+      </w:r>
+    </w:p>
+    <w:p>
+      <w:pPr>
+        <w:pStyle w:val="ListBullet"/>
+      </w:pPr>
+      <w:r>
+        <w:t>El secreto que se usa es la «Clave secreta de la app de Instagram» (en Configuración de la API con inicio de sesión de Instagram), no la de Configuración → Básica. Se recomendó restablecerla porque apareció en una captura.</w:t>
+      </w:r>
+    </w:p>
+    <w:p>
+      <w:pPr>
+        <w:pStyle w:val="ListBullet"/>
+      </w:pPr>
+      <w:r>
+        <w:t>Meta confirma en el panel: los webhooks requieren la app publicada, y el acceso a datos en vivo requiere completar la revisión de la app.</w:t>
+      </w:r>
+    </w:p>
+    <w:p>
+      <w:pPr>
+        <w:pStyle w:val="Heading2"/>
+      </w:pPr>
+      <w:r>
+        <w:t>Día de la publicación (orden)</w:t>
+      </w:r>
+    </w:p>
+    <w:p>
+      <w:pPr>
+        <w:pStyle w:val="ListNumber"/>
+      </w:pPr>
+      <w:r>
+        <w:t>Fusionar la rama y esperar el deploy.</w:t>
+      </w:r>
+    </w:p>
+    <w:p>
+      <w:pPr>
+        <w:pStyle w:val="ListNumber"/>
+      </w:pPr>
+      <w:r>
+        <w:t>Generar el token en la app de Meta (paso 2) y pegarlo, junto con la clave secreta de Instagram, en Administrador → Instagram → Configuración de Meta.</w:t>
+      </w:r>
+    </w:p>
+    <w:p>
+      <w:pPr>
+        <w:pStyle w:val="ListNumber"/>
+      </w:pPr>
+      <w:r>
+        <w:t>Copiar URL de devolución de llamada y token de verificación del administrador al paso 3 de Meta → Verificar y guardar; activar la suscripción al webhook.</w:t>
+      </w:r>
+    </w:p>
+    <w:p>
+      <w:pPr>
+        <w:pStyle w:val="ListNumber"/>
+      </w:pPr>
+      <w:r>
+        <w:t>Publicar la app de Meta (modo Live) y asociar publicaciones a productos.</w:t>
+      </w:r>
+    </w:p>
+    <w:p>
+      <w:pPr>
+        <w:pStyle w:val="ListNumber"/>
+      </w:pPr>
+      <w:r>
+        <w:t>Probar con un comentario desde una cuenta evaluadora; luego solicitar la revisión de la app.</w:t>
       </w:r>
     </w:p>
     <w:sectPr>

</xml_diff>